<commit_message>
docs: add comprehensive application sitemap and update documentation index
</commit_message>
<xml_diff>
--- a/Frontend_Migration_Analysis_React_vs_Thymeleaf.docx
+++ b/Frontend_Migration_Analysis_React_vs_Thymeleaf.docx
@@ -1,11 +1,13 @@
 
 <file path=word/document.xml><?xml version="1.0" encoding="utf-8"?>
-<w:document xmlns:wpc="http://schemas.microsoft.com/office/word/2010/wordprocessingCanvas" xmlns:mo="http://schemas.microsoft.com/office/mac/office/2008/main" xmlns:mc="http://schemas.openxmlformats.org/markup-compatibility/2006" xmlns:mv="urn:schemas-microsoft-com:mac:vml" xmlns:o="urn:schemas-microsoft-com:office:office" xmlns:r="http://schemas.openxmlformats.org/officeDocument/2006/relationships" xmlns:m="http://schemas.openxmlformats.org/officeDocument/2006/math" xmlns:v="urn:schemas-microsoft-com:vml" xmlns:wp14="http://schemas.microsoft.com/office/word/2010/wordprocessingDrawing" xmlns:wp="http://schemas.openxmlformats.org/drawingml/2006/wordprocessingDrawing" xmlns:w10="urn:schemas-microsoft-com:office:word" xmlns:w="http://schemas.openxmlformats.org/wordprocessingml/2006/main" xmlns:w14="http://schemas.microsoft.com/office/word/2010/wordml" xmlns:wpg="http://schemas.microsoft.com/office/word/2010/wordprocessingGroup" xmlns:wpi="http://schemas.microsoft.com/office/word/2010/wordprocessingInk" xmlns:wne="http://schemas.microsoft.com/office/word/2006/wordml" xmlns:wps="http://schemas.microsoft.com/office/word/2010/wordprocessingShape" mc:Ignorable="w14 wp14">
+<w:document xmlns:wpc="http://schemas.microsoft.com/office/word/2010/wordprocessingCanvas" xmlns:mc="http://schemas.openxmlformats.org/markup-compatibility/2006" xmlns:o="urn:schemas-microsoft-com:office:office" xmlns:r="http://schemas.openxmlformats.org/officeDocument/2006/relationships" xmlns:m="http://schemas.openxmlformats.org/officeDocument/2006/math" xmlns:v="urn:schemas-microsoft-com:vml" xmlns:wp14="http://schemas.microsoft.com/office/word/2010/wordprocessingDrawing" xmlns:wp="http://schemas.openxmlformats.org/drawingml/2006/wordprocessingDrawing" xmlns:w10="urn:schemas-microsoft-com:office:word" xmlns:w="http://schemas.openxmlformats.org/wordprocessingml/2006/main" xmlns:w14="http://schemas.microsoft.com/office/word/2010/wordml" xmlns:wpg="http://schemas.microsoft.com/office/word/2010/wordprocessingGroup" xmlns:wpi="http://schemas.microsoft.com/office/word/2010/wordprocessingInk" xmlns:wne="http://schemas.microsoft.com/office/word/2006/wordml" xmlns:wps="http://schemas.microsoft.com/office/word/2010/wordprocessingShape" mc:Ignorable="w14 wp14">
   <w:body>
     <w:p>
       <w:pPr>
         <w:spacing w:after="40"/>
       </w:pPr>
+      <w:bookmarkStart w:id="0" w:name="_GoBack"/>
+      <w:bookmarkEnd w:id="0"/>
       <w:r>
         <w:rPr>
           <w:b/>
@@ -27,6 +29,14 @@
           <w:sz w:val="44"/>
         </w:rPr>
         <w:t>Frontend Architecture Assessment:</w:t>
+      </w:r>
+      <w:r>
+        <w:rPr>
+          <w:rFonts w:ascii="Arial" w:hAnsi="Arial"/>
+          <w:b/>
+          <w:color w:val="0F172A"/>
+          <w:sz w:val="44"/>
+        </w:rPr>
         <w:br/>
         <w:t>Migrating from Thymeleaf + HTMX to React</w:t>
       </w:r>
@@ -39,7 +49,6 @@
         <w:rPr>
           <w:i/>
           <w:color w:val="64748B"/>
-          <w:sz w:val="22"/>
         </w:rPr>
         <w:t>Technical Trade-offs, Effort Estimation, Security Implications, and Team Strategic Recommendations</w:t>
       </w:r>
@@ -68,27 +77,33 @@
         <w:spacing w:after="160"/>
       </w:pPr>
       <w:r>
-        <w:t>A central architectural question has arisen for the You_can development team: Will migrating the existing Spring Boot + Thymeleaf + HTMX frontend to a decoupled React Single Page Application (SPA) be beneficial to the project?</w:t>
+        <w:t>A central architectural question has arisen for the You_can development team: Will migrating the existing Spring Boot + Thymeleaf + HTMX frontend to a decoupled Re</w:t>
+      </w:r>
+      <w:r>
+        <w:t>act Single Page Application (SPA) be beneficial to the project?</w:t>
       </w:r>
     </w:p>
     <w:tbl>
       <w:tblPr>
-        <w:tblW w:type="auto" w:w="0"/>
+        <w:tblW w:w="0" w:type="auto"/>
         <w:jc w:val="center"/>
-        <w:tblLook w:firstColumn="1" w:firstRow="1" w:lastColumn="0" w:lastRow="0" w:noHBand="0" w:noVBand="1" w:val="04A0"/>
+        <w:tblLook w:val="04A0" w:firstRow="1" w:lastRow="0" w:firstColumn="1" w:lastColumn="0" w:noHBand="0" w:noVBand="1"/>
       </w:tblPr>
       <w:tblGrid>
         <w:gridCol w:w="9936"/>
       </w:tblGrid>
       <w:tr>
+        <w:trPr>
+          <w:jc w:val="center"/>
+        </w:trPr>
         <w:tc>
           <w:tcPr>
-            <w:tcW w:type="dxa" w:w="9936"/>
-            <w:shd w:fill="F0F9FF"/>
+            <w:tcW w:w="9936" w:type="dxa"/>
+            <w:shd w:val="clear" w:color="auto" w:fill="F0F9FF"/>
             <w:tcMar>
               <w:top w:w="140" w:type="dxa"/>
+              <w:left w:w="200" w:type="dxa"/>
               <w:bottom w:w="140" w:type="dxa"/>
-              <w:left w:w="200" w:type="dxa"/>
               <w:right w:w="200" w:type="dxa"/>
             </w:tcMar>
           </w:tcPr>
@@ -100,20 +115,47 @@
               <w:rPr>
                 <w:b/>
                 <w:color w:val="0369A1"/>
-                <w:sz w:val="22"/>
               </w:rPr>
               <w:t>THE VERDICT AT A GLANCE:</w:t>
+            </w:r>
+            <w:r>
+              <w:rPr>
+                <w:b/>
+                <w:color w:val="0369A1"/>
+              </w:rPr>
               <w:br/>
             </w:r>
             <w:r>
               <w:rPr>
                 <w:sz w:val="20"/>
               </w:rPr>
-              <w:t>• For University Production &amp; Delivery: NO. The current stack is already fully operational, fast, secure, packages into a single zero-dependency JAR, and passes all 67/67 automated end-to-end tests.</w:t>
+              <w:t>• For University Production &amp; Delivery: NO. The current stack is already fully operational, fast, secure, packages into a single zero-dependency JAR, and passes all 67</w:t>
+            </w:r>
+            <w:r>
+              <w:rPr>
+                <w:sz w:val="20"/>
+              </w:rPr>
+              <w:t>/67 automated end-to-end tests.</w:t>
+            </w:r>
+            <w:r>
+              <w:rPr>
+                <w:sz w:val="20"/>
+              </w:rPr>
               <w:br/>
               <w:t>• For Student Career &amp; Resume Impact: YES. React is the dominant frontend technology sought by enterprise campus recruiters for full-stack SDE roles.</w:t>
+            </w:r>
+            <w:r>
+              <w:rPr>
+                <w:sz w:val="20"/>
+              </w:rPr>
               <w:br/>
-              <w:t>• Recommended Compromise: Keep the monolithic Spring Boot + Thymeleaf core for institutional stability, and expose clean REST API endpoints for a dedicated React sub-module (such as an interactive analytics dashboard or candidate cockpit).</w:t>
+              <w:t>• Recommended Compromise: Keep the monolithic Spring Boot + Thymeleaf core</w:t>
+            </w:r>
+            <w:r>
+              <w:rPr>
+                <w:sz w:val="20"/>
+              </w:rPr>
+              <w:t xml:space="preserve"> for institutional stability, and expose clean REST API endpoints for a dedicated React sub-module (such as an interactive analytics dashboard or candidate cockpit).</w:t>
             </w:r>
           </w:p>
         </w:tc>
@@ -134,17 +176,36 @@
     </w:p>
     <w:p>
       <w:r>
-        <w:t>The You_can portal is architected as a high-performance modern server-driven application built on:</w:t>
+        <w:t xml:space="preserve">The You_can portal is architected </w:t>
+      </w:r>
+      <w:r>
+        <w:t>as a high-performance modern server-driven application built on:</w:t>
+      </w:r>
+      <w:r>
         <w:br/>
         <w:t>1. Backend: Java 21, Spring Boot 3.4.3, Spring Security 6, Spring Data JPA, Hibernate 6.6.</w:t>
+      </w:r>
+      <w:r>
         <w:br/>
         <w:t>2. Database: File-backed H2 (PostgreSQL compatibility mode) with Flyway migrations (V1 to V7).</w:t>
+      </w:r>
+      <w:r>
         <w:br/>
-        <w:t>3. Presentation Layer: Thymeleaf 3 HTML5 templates + HTMX 1.9 for declarative partial swaps without full page reloads.</w:t>
+        <w:t>3. Pr</w:t>
+      </w:r>
+      <w:r>
+        <w:t>esentation Layer: Thymeleaf 3 HTML5 templates + HTMX 1.9 for declarative partial swaps without full page reloads.</w:t>
+      </w:r>
+      <w:r>
         <w:br/>
         <w:t>4. Styling: Bootstrap 5.3 + Custom CSS Design System (support for Light/Dark themes, high-density layouts).</w:t>
+      </w:r>
+      <w:r>
         <w:br/>
-        <w:t>5. Testing Suite: 67 End-to-End system tests verifying authentication, role boundaries, CSRF, mock bookings, and moderation queues.</w:t>
+        <w:t>5. Testing Suite: 67 End-to-End sy</w:t>
+      </w:r>
+      <w:r>
+        <w:t>stem tests verifying authentication, role boundaries, CSRF, mock bookings, and moderation queues.</w:t>
       </w:r>
     </w:p>
     <w:p>
@@ -158,23 +219,59 @@
     <w:p>
       <w:r>
         <w:t>A. High Industry &amp; Resume Appeal:</w:t>
+      </w:r>
+      <w:r>
         <w:br/>
-        <w:t>Enterprise hiring managers and campus recruiters (e.g., Google, Microsoft, Amazon, ServiceNow, ZS Associates) prioritize candidates proficient in modern component-driven libraries like React and TypeScript. Showcasing a decoupled React + Spring Boot REST application on GitHub directly increases resume shortlisting probability.</w:t>
+        <w:t>Enterprise hiring managers and campus recruiters (e.g., Google, Microsoft, Amaz</w:t>
+      </w:r>
+      <w:r>
+        <w:t>on, ServiceNow, ZS Associates) prioritize candidates proficient in modern component-driven libraries like React and TypeScript. Showcasing a decoupled React + Spring Boot REST application on GitHub directly increases resume shortlisting probability.</w:t>
+      </w:r>
+      <w:r>
         <w:br/>
+      </w:r>
+      <w:r>
+        <w:lastRenderedPageBreak/>
         <w:br/>
-        <w:t>B. Advanced Client-Side State Management:</w:t>
+        <w:t>B. Ad</w:t>
+      </w:r>
+      <w:r>
+        <w:t>vanced Client-Side State Management:</w:t>
+      </w:r>
+      <w:r>
         <w:br/>
-        <w:t>React excels in user interfaces with highly dynamic, granular client state. Features such as a live in-browser coding sandbox, drag-and-drop resume ATS builder, or interactive visual timeline editors are inherently more natural to implement in React than in server-rendered templates.</w:t>
+        <w:t>React excels in user interfaces with highly dynamic, granular client state. Features such as a live in-browser coding sandbox, drag-and-drop resume ATS builder, or interactive visual timeline editors are inherently more</w:t>
+      </w:r>
+      <w:r>
+        <w:t xml:space="preserve"> natural to implement in React than in server-rendered templates.</w:t>
+      </w:r>
+      <w:r>
         <w:br/>
+      </w:r>
+      <w:r>
         <w:br/>
         <w:t>C. Mobile Ecosystem Reusability (React Native):</w:t>
+      </w:r>
+      <w:r>
         <w:br/>
-        <w:t>If JECRC University subsequently commissions an Android/iOS mobile application for students, transitioning the backend to standard JSON REST APIs allows React Native to reuse the business logic, types, and API client layers seamlessly.</w:t>
+        <w:t xml:space="preserve">If JECRC University subsequently commissions an Android/iOS mobile application for students, transitioning the backend to standard JSON REST </w:t>
+      </w:r>
+      <w:r>
+        <w:t>APIs allows React Native to reuse the business logic, types, and API client layers seamlessly.</w:t>
+      </w:r>
+      <w:r>
         <w:br/>
+      </w:r>
+      <w:r>
         <w:br/>
         <w:t>D. Vast Component Ecosystem:</w:t>
+      </w:r>
+      <w:r>
         <w:br/>
-        <w:t>Access to enterprise UI kits (Shadcn UI, Radix primitives, Tailwind CSS, TanStack Table, Lucide icons, Framer Motion) allows rapid assembly of sleek, animated components.</w:t>
+        <w:t xml:space="preserve">Access to enterprise UI kits (Shadcn UI, Radix primitives, Tailwind CSS, TanStack Table, Lucide icons, Framer Motion) allows rapid </w:t>
+      </w:r>
+      <w:r>
+        <w:t>assembly of sleek, animated components.</w:t>
       </w:r>
     </w:p>
     <w:p>
@@ -188,36 +285,88 @@
     <w:p>
       <w:r>
         <w:t>A. Massive Refactoring Effort (Estimated 80–120 Developer Hours):</w:t>
+      </w:r>
+      <w:r>
         <w:br/>
-        <w:t>The portal currently features 30+ production views across Student, Admin, and Alumni roles. Migrating requires rewriting every single page, form, modal, validation feedback, and chart into React functional components.</w:t>
+        <w:t>The portal currently features 30+ production views across Student, Admin, and Alumni roles. Migr</w:t>
+      </w:r>
+      <w:r>
+        <w:t>ating requires rewriting every single page, form, modal, validation feedback, and chart into React functional components.</w:t>
+      </w:r>
+      <w:r>
         <w:br/>
+      </w:r>
+      <w:r>
         <w:br/>
         <w:t>B. Complete Auth &amp; Security Re-architecture:</w:t>
+      </w:r>
+      <w:r>
         <w:br/>
-        <w:t>Currently, Spring Security provides session-based authentication with automatic CSRF protection and server-enforced role access (`sec:authorize`). With React:</w:t>
+        <w:t>Currently, Spring Security provides session-based authentication with automatic CSRF pro</w:t>
+      </w:r>
+      <w:r>
+        <w:t>tection and server-enforced role access (`sec:authorize`). With React:</w:t>
+      </w:r>
+      <w:r>
         <w:br/>
         <w:t>• The backend must be converted to Stateless JWTs or complex HTTP-Only cookie refresh mechanisms.</w:t>
+      </w:r>
+      <w:r>
         <w:br/>
         <w:t>• Cross-Origin Resource Sharing (CORS) must be configured and secured.</w:t>
+      </w:r>
+      <w:r>
         <w:br/>
-        <w:t>• Route guards must be duplicated on the client side, while still guarding backend endpoints to avoid data leakage.</w:t>
+        <w:t>• Route guards m</w:t>
+      </w:r>
+      <w:r>
+        <w:t>ust be duplicated on the client side, while still guarding backend endpoints to avoid data leakage.</w:t>
+      </w:r>
+      <w:r>
         <w:br/>
+      </w:r>
+      <w:r>
         <w:br/>
         <w:t>C. Backend Controller Overhaul:</w:t>
+      </w:r>
+      <w:r>
         <w:br/>
-        <w:t>All 15+ existing Spring MVC `@Controller` classes that return `ModelAndView` or template view strings must be rewritten into `@RestController` endpoints returning strongly typed DTOs.</w:t>
+        <w:t>All 15+ existing Spring MVC `@Controller` classes that return `ModelAndView` or template view strings must be rewritten int</w:t>
+      </w:r>
+      <w:r>
+        <w:t>o `@RestController` endpoints returning strongly typed DTOs.</w:t>
+      </w:r>
+      <w:r>
         <w:br/>
+      </w:r>
+      <w:r>
         <w:br/>
         <w:t>D. Operational &amp; Deployment Friction:</w:t>
+      </w:r>
+      <w:r>
         <w:br/>
         <w:t>• Monolith (Current): Single deployment. Run `mvn spring-boot:run` or execute `youcan.jar`. Zero build tool synchronization needed.</w:t>
+      </w:r>
+      <w:r>
         <w:br/>
-        <w:t>• Decoupled (React): Requires Node.js/npm, Vite/Webpack build pipelines, CI/CD for both frontend (Vercel/Netlify/S3) and backend (EC2/Render/Docker), plus environment-variable coordination for API base URLs.</w:t>
+        <w:t>• Decoupled (React): Req</w:t>
+      </w:r>
+      <w:r>
+        <w:t>uires Node.js/npm, Vite/Webpack build pipelines, CI/CD for both frontend (Vercel/Netlify/S3) and backend (EC2/Render/Docker), plus environment-variable coordination for API base URLs.</w:t>
+      </w:r>
+      <w:r>
         <w:br/>
+      </w:r>
+      <w:r>
         <w:br/>
         <w:t>E. HTMX Already Delivers 90% of React's Perceived Value:</w:t>
+      </w:r>
+      <w:r>
         <w:br/>
-        <w:t>HTMX provides instant live search, debounce filtering, batch tab switching, and dynamic fragment updating without page reloads or client-side bundle lag.</w:t>
+        <w:t xml:space="preserve">HTMX provides </w:t>
+      </w:r>
+      <w:r>
+        <w:t>instant live search, debounce filtering, batch tab switching, and dynamic fragment updating without page reloads or client-side bundle lag.</w:t>
       </w:r>
     </w:p>
     <w:p>
@@ -225,15 +374,16 @@
         <w:pStyle w:val="Heading1"/>
       </w:pPr>
       <w:r>
+        <w:lastRenderedPageBreak/>
         <w:t>5. Architectural Comparison Matrix</w:t>
       </w:r>
     </w:p>
     <w:tbl>
       <w:tblPr>
-        <w:tblW w:type="auto" w:w="0"/>
+        <w:tblW w:w="0" w:type="auto"/>
         <w:jc w:val="center"/>
         <w:tblLayout w:type="fixed"/>
-        <w:tblLook w:firstColumn="1" w:firstRow="1" w:lastColumn="0" w:lastRow="0" w:noHBand="0" w:noVBand="1" w:val="04A0"/>
+        <w:tblLook w:val="04A0" w:firstRow="1" w:lastRow="0" w:firstColumn="1" w:lastColumn="0" w:noHBand="0" w:noVBand="1"/>
       </w:tblPr>
       <w:tblGrid>
         <w:gridCol w:w="3312"/>
@@ -241,14 +391,17 @@
         <w:gridCol w:w="3312"/>
       </w:tblGrid>
       <w:tr>
+        <w:trPr>
+          <w:jc w:val="center"/>
+        </w:trPr>
         <w:tc>
           <w:tcPr>
-            <w:tcW w:type="dxa" w:w="3312"/>
-            <w:shd w:fill="1E293B"/>
+            <w:tcW w:w="3312" w:type="dxa"/>
+            <w:shd w:val="clear" w:color="auto" w:fill="1E293B"/>
             <w:tcMar>
               <w:top w:w="120" w:type="dxa"/>
+              <w:left w:w="150" w:type="dxa"/>
               <w:bottom w:w="120" w:type="dxa"/>
-              <w:left w:w="150" w:type="dxa"/>
               <w:right w:w="150" w:type="dxa"/>
             </w:tcMar>
           </w:tcPr>
@@ -265,12 +418,12 @@
         </w:tc>
         <w:tc>
           <w:tcPr>
-            <w:tcW w:type="dxa" w:w="3312"/>
-            <w:shd w:fill="1E293B"/>
+            <w:tcW w:w="3312" w:type="dxa"/>
+            <w:shd w:val="clear" w:color="auto" w:fill="1E293B"/>
             <w:tcMar>
               <w:top w:w="120" w:type="dxa"/>
+              <w:left w:w="150" w:type="dxa"/>
               <w:bottom w:w="120" w:type="dxa"/>
-              <w:left w:w="150" w:type="dxa"/>
               <w:right w:w="150" w:type="dxa"/>
             </w:tcMar>
           </w:tcPr>
@@ -287,12 +440,12 @@
         </w:tc>
         <w:tc>
           <w:tcPr>
-            <w:tcW w:type="dxa" w:w="3312"/>
-            <w:shd w:fill="1E293B"/>
+            <w:tcW w:w="3312" w:type="dxa"/>
+            <w:shd w:val="clear" w:color="auto" w:fill="1E293B"/>
             <w:tcMar>
               <w:top w:w="120" w:type="dxa"/>
+              <w:left w:w="150" w:type="dxa"/>
               <w:bottom w:w="120" w:type="dxa"/>
-              <w:left w:w="150" w:type="dxa"/>
               <w:right w:w="150" w:type="dxa"/>
             </w:tcMar>
           </w:tcPr>
@@ -309,14 +462,17 @@
         </w:tc>
       </w:tr>
       <w:tr>
+        <w:trPr>
+          <w:jc w:val="center"/>
+        </w:trPr>
         <w:tc>
           <w:tcPr>
-            <w:tcW w:type="dxa" w:w="3312"/>
-            <w:shd w:fill="F8FAFC"/>
+            <w:tcW w:w="3312" w:type="dxa"/>
+            <w:shd w:val="clear" w:color="auto" w:fill="F8FAFC"/>
             <w:tcMar>
               <w:top w:w="100" w:type="dxa"/>
+              <w:left w:w="140" w:type="dxa"/>
               <w:bottom w:w="100" w:type="dxa"/>
-              <w:left w:w="140" w:type="dxa"/>
               <w:right w:w="140" w:type="dxa"/>
             </w:tcMar>
           </w:tcPr>
@@ -332,12 +488,12 @@
         </w:tc>
         <w:tc>
           <w:tcPr>
-            <w:tcW w:type="dxa" w:w="3312"/>
-            <w:shd w:fill="F8FAFC"/>
+            <w:tcW w:w="3312" w:type="dxa"/>
+            <w:shd w:val="clear" w:color="auto" w:fill="F8FAFC"/>
             <w:tcMar>
               <w:top w:w="100" w:type="dxa"/>
+              <w:left w:w="140" w:type="dxa"/>
               <w:bottom w:w="100" w:type="dxa"/>
-              <w:left w:w="140" w:type="dxa"/>
               <w:right w:w="140" w:type="dxa"/>
             </w:tcMar>
           </w:tcPr>
@@ -352,12 +508,12 @@
         </w:tc>
         <w:tc>
           <w:tcPr>
-            <w:tcW w:type="dxa" w:w="3312"/>
-            <w:shd w:fill="F8FAFC"/>
+            <w:tcW w:w="3312" w:type="dxa"/>
+            <w:shd w:val="clear" w:color="auto" w:fill="F8FAFC"/>
             <w:tcMar>
               <w:top w:w="100" w:type="dxa"/>
+              <w:left w:w="140" w:type="dxa"/>
               <w:bottom w:w="100" w:type="dxa"/>
-              <w:left w:w="140" w:type="dxa"/>
               <w:right w:w="140" w:type="dxa"/>
             </w:tcMar>
           </w:tcPr>
@@ -372,14 +528,17 @@
         </w:tc>
       </w:tr>
       <w:tr>
+        <w:trPr>
+          <w:jc w:val="center"/>
+        </w:trPr>
         <w:tc>
           <w:tcPr>
-            <w:tcW w:type="dxa" w:w="3312"/>
-            <w:shd w:fill="FFFFFF"/>
+            <w:tcW w:w="3312" w:type="dxa"/>
+            <w:shd w:val="clear" w:color="auto" w:fill="FFFFFF"/>
             <w:tcMar>
               <w:top w:w="100" w:type="dxa"/>
+              <w:left w:w="140" w:type="dxa"/>
               <w:bottom w:w="100" w:type="dxa"/>
-              <w:left w:w="140" w:type="dxa"/>
               <w:right w:w="140" w:type="dxa"/>
             </w:tcMar>
           </w:tcPr>
@@ -395,12 +554,12 @@
         </w:tc>
         <w:tc>
           <w:tcPr>
-            <w:tcW w:type="dxa" w:w="3312"/>
-            <w:shd w:fill="FFFFFF"/>
+            <w:tcW w:w="3312" w:type="dxa"/>
+            <w:shd w:val="clear" w:color="auto" w:fill="FFFFFF"/>
             <w:tcMar>
               <w:top w:w="100" w:type="dxa"/>
+              <w:left w:w="140" w:type="dxa"/>
               <w:bottom w:w="100" w:type="dxa"/>
-              <w:left w:w="140" w:type="dxa"/>
               <w:right w:w="140" w:type="dxa"/>
             </w:tcMar>
           </w:tcPr>
@@ -409,18 +568,24 @@
               <w:rPr>
                 <w:sz w:val="19"/>
               </w:rPr>
-              <w:t>Fast: Changes to HTML/CSS immediately reflect without rebuilding bundles.</w:t>
+              <w:t>Fast: Changes to HTML/CSS immediately reflect without rebuilding bundle</w:t>
+            </w:r>
+            <w:r>
+              <w:rPr>
+                <w:sz w:val="19"/>
+              </w:rPr>
+              <w:t>s.</w:t>
             </w:r>
           </w:p>
         </w:tc>
         <w:tc>
           <w:tcPr>
-            <w:tcW w:type="dxa" w:w="3312"/>
-            <w:shd w:fill="FFFFFF"/>
+            <w:tcW w:w="3312" w:type="dxa"/>
+            <w:shd w:val="clear" w:color="auto" w:fill="FFFFFF"/>
             <w:tcMar>
               <w:top w:w="100" w:type="dxa"/>
+              <w:left w:w="140" w:type="dxa"/>
               <w:bottom w:w="100" w:type="dxa"/>
-              <w:left w:w="140" w:type="dxa"/>
               <w:right w:w="140" w:type="dxa"/>
             </w:tcMar>
           </w:tcPr>
@@ -435,14 +600,17 @@
         </w:tc>
       </w:tr>
       <w:tr>
+        <w:trPr>
+          <w:jc w:val="center"/>
+        </w:trPr>
         <w:tc>
           <w:tcPr>
-            <w:tcW w:type="dxa" w:w="3312"/>
-            <w:shd w:fill="F8FAFC"/>
+            <w:tcW w:w="3312" w:type="dxa"/>
+            <w:shd w:val="clear" w:color="auto" w:fill="F8FAFC"/>
             <w:tcMar>
               <w:top w:w="100" w:type="dxa"/>
+              <w:left w:w="140" w:type="dxa"/>
               <w:bottom w:w="100" w:type="dxa"/>
-              <w:left w:w="140" w:type="dxa"/>
               <w:right w:w="140" w:type="dxa"/>
             </w:tcMar>
           </w:tcPr>
@@ -458,12 +626,12 @@
         </w:tc>
         <w:tc>
           <w:tcPr>
-            <w:tcW w:type="dxa" w:w="3312"/>
-            <w:shd w:fill="F8FAFC"/>
+            <w:tcW w:w="3312" w:type="dxa"/>
+            <w:shd w:val="clear" w:color="auto" w:fill="F8FAFC"/>
             <w:tcMar>
               <w:top w:w="100" w:type="dxa"/>
+              <w:left w:w="140" w:type="dxa"/>
               <w:bottom w:w="100" w:type="dxa"/>
-              <w:left w:w="140" w:type="dxa"/>
               <w:right w:w="140" w:type="dxa"/>
             </w:tcMar>
           </w:tcPr>
@@ -478,12 +646,12 @@
         </w:tc>
         <w:tc>
           <w:tcPr>
-            <w:tcW w:type="dxa" w:w="3312"/>
-            <w:shd w:fill="F8FAFC"/>
+            <w:tcW w:w="3312" w:type="dxa"/>
+            <w:shd w:val="clear" w:color="auto" w:fill="F8FAFC"/>
             <w:tcMar>
               <w:top w:w="100" w:type="dxa"/>
+              <w:left w:w="140" w:type="dxa"/>
               <w:bottom w:w="100" w:type="dxa"/>
-              <w:left w:w="140" w:type="dxa"/>
               <w:right w:w="140" w:type="dxa"/>
             </w:tcMar>
           </w:tcPr>
@@ -498,14 +666,17 @@
         </w:tc>
       </w:tr>
       <w:tr>
+        <w:trPr>
+          <w:jc w:val="center"/>
+        </w:trPr>
         <w:tc>
           <w:tcPr>
-            <w:tcW w:type="dxa" w:w="3312"/>
-            <w:shd w:fill="FFFFFF"/>
+            <w:tcW w:w="3312" w:type="dxa"/>
+            <w:shd w:val="clear" w:color="auto" w:fill="FFFFFF"/>
             <w:tcMar>
               <w:top w:w="100" w:type="dxa"/>
+              <w:left w:w="140" w:type="dxa"/>
               <w:bottom w:w="100" w:type="dxa"/>
-              <w:left w:w="140" w:type="dxa"/>
               <w:right w:w="140" w:type="dxa"/>
             </w:tcMar>
           </w:tcPr>
@@ -515,18 +686,25 @@
                 <w:b/>
                 <w:sz w:val="19"/>
               </w:rPr>
-              <w:t>Client Interactivity</w:t>
+              <w:t xml:space="preserve">Client </w:t>
+            </w:r>
+            <w:r>
+              <w:rPr>
+                <w:b/>
+                <w:sz w:val="19"/>
+              </w:rPr>
+              <w:t>Interactivity</w:t>
             </w:r>
           </w:p>
         </w:tc>
         <w:tc>
           <w:tcPr>
-            <w:tcW w:type="dxa" w:w="3312"/>
-            <w:shd w:fill="FFFFFF"/>
+            <w:tcW w:w="3312" w:type="dxa"/>
+            <w:shd w:val="clear" w:color="auto" w:fill="FFFFFF"/>
             <w:tcMar>
               <w:top w:w="100" w:type="dxa"/>
+              <w:left w:w="140" w:type="dxa"/>
               <w:bottom w:w="100" w:type="dxa"/>
-              <w:left w:w="140" w:type="dxa"/>
               <w:right w:w="140" w:type="dxa"/>
             </w:tcMar>
           </w:tcPr>
@@ -541,12 +719,12 @@
         </w:tc>
         <w:tc>
           <w:tcPr>
-            <w:tcW w:type="dxa" w:w="3312"/>
-            <w:shd w:fill="FFFFFF"/>
+            <w:tcW w:w="3312" w:type="dxa"/>
+            <w:shd w:val="clear" w:color="auto" w:fill="FFFFFF"/>
             <w:tcMar>
               <w:top w:w="100" w:type="dxa"/>
+              <w:left w:w="140" w:type="dxa"/>
               <w:bottom w:w="100" w:type="dxa"/>
-              <w:left w:w="140" w:type="dxa"/>
               <w:right w:w="140" w:type="dxa"/>
             </w:tcMar>
           </w:tcPr>
@@ -561,14 +739,17 @@
         </w:tc>
       </w:tr>
       <w:tr>
+        <w:trPr>
+          <w:jc w:val="center"/>
+        </w:trPr>
         <w:tc>
           <w:tcPr>
-            <w:tcW w:type="dxa" w:w="3312"/>
-            <w:shd w:fill="F8FAFC"/>
+            <w:tcW w:w="3312" w:type="dxa"/>
+            <w:shd w:val="clear" w:color="auto" w:fill="F8FAFC"/>
             <w:tcMar>
               <w:top w:w="100" w:type="dxa"/>
+              <w:left w:w="140" w:type="dxa"/>
               <w:bottom w:w="100" w:type="dxa"/>
-              <w:left w:w="140" w:type="dxa"/>
               <w:right w:w="140" w:type="dxa"/>
             </w:tcMar>
           </w:tcPr>
@@ -584,12 +765,12 @@
         </w:tc>
         <w:tc>
           <w:tcPr>
-            <w:tcW w:type="dxa" w:w="3312"/>
-            <w:shd w:fill="F8FAFC"/>
+            <w:tcW w:w="3312" w:type="dxa"/>
+            <w:shd w:val="clear" w:color="auto" w:fill="F8FAFC"/>
             <w:tcMar>
               <w:top w:w="100" w:type="dxa"/>
+              <w:left w:w="140" w:type="dxa"/>
               <w:bottom w:w="100" w:type="dxa"/>
-              <w:left w:w="140" w:type="dxa"/>
               <w:right w:w="140" w:type="dxa"/>
             </w:tcMar>
           </w:tcPr>
@@ -604,12 +785,12 @@
         </w:tc>
         <w:tc>
           <w:tcPr>
-            <w:tcW w:type="dxa" w:w="3312"/>
-            <w:shd w:fill="F8FAFC"/>
+            <w:tcW w:w="3312" w:type="dxa"/>
+            <w:shd w:val="clear" w:color="auto" w:fill="F8FAFC"/>
             <w:tcMar>
               <w:top w:w="100" w:type="dxa"/>
+              <w:left w:w="140" w:type="dxa"/>
               <w:bottom w:w="100" w:type="dxa"/>
-              <w:left w:w="140" w:type="dxa"/>
               <w:right w:w="140" w:type="dxa"/>
             </w:tcMar>
           </w:tcPr>
@@ -618,20 +799,29 @@
               <w:rPr>
                 <w:sz w:val="19"/>
               </w:rPr>
-              <w:t>Requires bundle download &amp; hydration (mitigated only via SSR/Next.js).</w:t>
+              <w:t>Requires</w:t>
+            </w:r>
+            <w:r>
+              <w:rPr>
+                <w:sz w:val="19"/>
+              </w:rPr>
+              <w:t xml:space="preserve"> bundle download &amp; hydration (mitigated only via SSR/Next.js).</w:t>
             </w:r>
           </w:p>
         </w:tc>
       </w:tr>
       <w:tr>
+        <w:trPr>
+          <w:jc w:val="center"/>
+        </w:trPr>
         <w:tc>
           <w:tcPr>
-            <w:tcW w:type="dxa" w:w="3312"/>
-            <w:shd w:fill="FFFFFF"/>
+            <w:tcW w:w="3312" w:type="dxa"/>
+            <w:shd w:val="clear" w:color="auto" w:fill="FFFFFF"/>
             <w:tcMar>
               <w:top w:w="100" w:type="dxa"/>
+              <w:left w:w="140" w:type="dxa"/>
               <w:bottom w:w="100" w:type="dxa"/>
-              <w:left w:w="140" w:type="dxa"/>
               <w:right w:w="140" w:type="dxa"/>
             </w:tcMar>
           </w:tcPr>
@@ -647,12 +837,12 @@
         </w:tc>
         <w:tc>
           <w:tcPr>
-            <w:tcW w:type="dxa" w:w="3312"/>
-            <w:shd w:fill="FFFFFF"/>
+            <w:tcW w:w="3312" w:type="dxa"/>
+            <w:shd w:val="clear" w:color="auto" w:fill="FFFFFF"/>
             <w:tcMar>
               <w:top w:w="100" w:type="dxa"/>
+              <w:left w:w="140" w:type="dxa"/>
               <w:bottom w:w="100" w:type="dxa"/>
-              <w:left w:w="140" w:type="dxa"/>
               <w:right w:w="140" w:type="dxa"/>
             </w:tcMar>
           </w:tcPr>
@@ -667,12 +857,12 @@
         </w:tc>
         <w:tc>
           <w:tcPr>
-            <w:tcW w:type="dxa" w:w="3312"/>
-            <w:shd w:fill="FFFFFF"/>
+            <w:tcW w:w="3312" w:type="dxa"/>
+            <w:shd w:val="clear" w:color="auto" w:fill="FFFFFF"/>
             <w:tcMar>
               <w:top w:w="100" w:type="dxa"/>
+              <w:left w:w="140" w:type="dxa"/>
               <w:bottom w:w="100" w:type="dxa"/>
-              <w:left w:w="140" w:type="dxa"/>
               <w:right w:w="140" w:type="dxa"/>
             </w:tcMar>
           </w:tcPr>
@@ -687,14 +877,17 @@
         </w:tc>
       </w:tr>
       <w:tr>
+        <w:trPr>
+          <w:jc w:val="center"/>
+        </w:trPr>
         <w:tc>
           <w:tcPr>
-            <w:tcW w:type="dxa" w:w="3312"/>
-            <w:shd w:fill="F8FAFC"/>
+            <w:tcW w:w="3312" w:type="dxa"/>
+            <w:shd w:val="clear" w:color="auto" w:fill="F8FAFC"/>
             <w:tcMar>
               <w:top w:w="100" w:type="dxa"/>
+              <w:left w:w="140" w:type="dxa"/>
               <w:bottom w:w="100" w:type="dxa"/>
-              <w:left w:w="140" w:type="dxa"/>
               <w:right w:w="140" w:type="dxa"/>
             </w:tcMar>
           </w:tcPr>
@@ -710,12 +903,12 @@
         </w:tc>
         <w:tc>
           <w:tcPr>
-            <w:tcW w:type="dxa" w:w="3312"/>
-            <w:shd w:fill="F8FAFC"/>
+            <w:tcW w:w="3312" w:type="dxa"/>
+            <w:shd w:val="clear" w:color="auto" w:fill="F8FAFC"/>
             <w:tcMar>
               <w:top w:w="100" w:type="dxa"/>
+              <w:left w:w="140" w:type="dxa"/>
               <w:bottom w:w="100" w:type="dxa"/>
-              <w:left w:w="140" w:type="dxa"/>
               <w:right w:w="140" w:type="dxa"/>
             </w:tcMar>
           </w:tcPr>
@@ -724,18 +917,24 @@
               <w:rPr>
                 <w:sz w:val="19"/>
               </w:rPr>
-              <w:t>67/67 automated E2E tests currently passing out-of-the-box.</w:t>
+              <w:t xml:space="preserve">67/67 </w:t>
+            </w:r>
+            <w:r>
+              <w:rPr>
+                <w:sz w:val="19"/>
+              </w:rPr>
+              <w:t>automated E2E tests currently passing out-of-the-box.</w:t>
             </w:r>
           </w:p>
         </w:tc>
         <w:tc>
           <w:tcPr>
-            <w:tcW w:type="dxa" w:w="3312"/>
-            <w:shd w:fill="F8FAFC"/>
+            <w:tcW w:w="3312" w:type="dxa"/>
+            <w:shd w:val="clear" w:color="auto" w:fill="F8FAFC"/>
             <w:tcMar>
               <w:top w:w="100" w:type="dxa"/>
+              <w:left w:w="140" w:type="dxa"/>
               <w:bottom w:w="100" w:type="dxa"/>
-              <w:left w:w="140" w:type="dxa"/>
               <w:right w:w="140" w:type="dxa"/>
             </w:tcMar>
           </w:tcPr>
@@ -766,21 +965,49 @@
     <w:p>
       <w:r>
         <w:t>Option 1: Institutional Recommendation (Stay with Current Stack)</w:t>
+      </w:r>
+      <w:r>
         <w:br/>
-        <w:t>If the objective is delivering this placement portal for real usage at JECRC University, DO NOT migrate. The portal is polished, stable, secure, fast, and easily deployable by any campus system administrator.</w:t>
+        <w:t>If the objective is</w:t>
+      </w:r>
+      <w:r>
+        <w:t xml:space="preserve"> delivering this placement portal for real usage at JECRC University, DO NOT migrate. The portal is polished, stable, secure, fast, and easily deployable by any campus system administrator.</w:t>
+      </w:r>
+      <w:r>
         <w:br/>
+      </w:r>
+      <w:r>
         <w:br/>
         <w:t>Option 2: Career &amp; Portfolio Recommendation (The Hybrid Approach)</w:t>
+      </w:r>
+      <w:r>
         <w:br/>
         <w:t>If team members want React experience for interviews:</w:t>
+      </w:r>
+      <w:r>
         <w:br/>
         <w:t>1. DO NOT destroy the working Thymeleaf portal.</w:t>
+      </w:r>
+      <w:r>
         <w:br/>
         <w:t>2. Add a `in.jecrcu.placement.api` package with clean `@RestController` endpoints exposing core data (e.g. `/api/v1/companies`, `/api/v1/statistics`).</w:t>
+      </w:r>
+      <w:r>
         <w:br/>
-        <w:t>3. Build a standalone React micro-application (e.g., an interactive 'Student Placement Cockpit' or 'AI Interview Sandbox') that consumes the existing Spring Boot APIs.</w:t>
+        <w:t>3.</w:t>
+      </w:r>
+      <w:r>
+        <w:t xml:space="preserve"> Build a standalone React micro-application (e.g., an interactive 'Student Placement Cockpit' or 'AI Interview Sandbox') that consumes the existing Spring Boot APIs.</w:t>
+      </w:r>
+      <w:r>
         <w:br/>
-        <w:t>This gives you the BEST of both worlds: a 100% working institutional portal, plus a modern React frontend module to showcase to recruiters.</w:t>
+      </w:r>
+      <w:r>
+        <w:lastRenderedPageBreak/>
+        <w:t>This gives you the BEST of both worlds: a 100% working institutional portal, plus a modern</w:t>
+      </w:r>
+      <w:r>
+        <w:t xml:space="preserve"> React frontend module to showcase to recruiters.</w:t>
       </w:r>
     </w:p>
     <w:p>
@@ -807,7 +1034,7 @@
 </file>
 
 <file path=word/numbering.xml><?xml version="1.0" encoding="utf-8"?>
-<w:numbering xmlns:wpc="http://schemas.microsoft.com/office/word/2010/wordprocessingCanvas" xmlns:mo="http://schemas.microsoft.com/office/mac/office/2008/main" xmlns:mc="http://schemas.openxmlformats.org/markup-compatibility/2006" xmlns:mv="urn:schemas-microsoft-com:mac:vml" xmlns:o="urn:schemas-microsoft-com:office:office" xmlns:r="http://schemas.openxmlformats.org/officeDocument/2006/relationships" xmlns:m="http://schemas.openxmlformats.org/officeDocument/2006/math" xmlns:v="urn:schemas-microsoft-com:vml" xmlns:wp14="http://schemas.microsoft.com/office/word/2010/wordprocessingDrawing" xmlns:wp="http://schemas.openxmlformats.org/drawingml/2006/wordprocessingDrawing" xmlns:w10="urn:schemas-microsoft-com:office:word" xmlns:w="http://schemas.openxmlformats.org/wordprocessingml/2006/main" xmlns:w14="http://schemas.microsoft.com/office/word/2010/wordml" xmlns:wpg="http://schemas.microsoft.com/office/word/2010/wordprocessingGroup" xmlns:wpi="http://schemas.microsoft.com/office/word/2010/wordprocessingInk" xmlns:wne="http://schemas.microsoft.com/office/word/2006/wordml" xmlns:wps="http://schemas.microsoft.com/office/word/2010/wordprocessingShape" mc:Ignorable="w14 wp14">
+<w:numbering xmlns:wpc="http://schemas.microsoft.com/office/word/2010/wordprocessingCanvas" xmlns:mc="http://schemas.openxmlformats.org/markup-compatibility/2006" xmlns:o="urn:schemas-microsoft-com:office:office" xmlns:r="http://schemas.openxmlformats.org/officeDocument/2006/relationships" xmlns:m="http://schemas.openxmlformats.org/officeDocument/2006/math" xmlns:v="urn:schemas-microsoft-com:vml" xmlns:wp14="http://schemas.microsoft.com/office/word/2010/wordprocessingDrawing" xmlns:wp="http://schemas.openxmlformats.org/drawingml/2006/wordprocessingDrawing" xmlns:w10="urn:schemas-microsoft-com:office:word" xmlns:w="http://schemas.openxmlformats.org/wordprocessingml/2006/main" xmlns:w14="http://schemas.microsoft.com/office/word/2010/wordml" xmlns:wpg="http://schemas.microsoft.com/office/word/2010/wordprocessingGroup" xmlns:wpi="http://schemas.microsoft.com/office/word/2010/wordprocessingInk" xmlns:wne="http://schemas.microsoft.com/office/word/2006/wordml" xmlns:wps="http://schemas.microsoft.com/office/word/2010/wordprocessingShape" mc:Ignorable="w14 wp14">
   <w:abstractNum w:abstractNumId="0">
     <w:nsid w:val="FFFFFF7C"/>
     <w:multiLevelType w:val="singleLevel"/>
@@ -1026,7 +1253,7 @@
       </w:pPr>
     </w:pPrDefault>
   </w:docDefaults>
-  <w:latentStyles w:defLockedState="0" w:defUIPriority="99" w:defSemiHidden="1" w:defUnhideWhenUsed="1" w:defQFormat="0" w:count="276">
+  <w:latentStyles w:defLockedState="0" w:defUIPriority="99" w:defSemiHidden="1" w:defUnhideWhenUsed="1" w:defQFormat="0" w:count="267">
     <w:lsdException w:name="Normal" w:semiHidden="0" w:uiPriority="0" w:unhideWhenUsed="0" w:qFormat="1"/>
     <w:lsdException w:name="heading 1" w:semiHidden="0" w:uiPriority="9" w:unhideWhenUsed="0" w:qFormat="1"/>
     <w:lsdException w:name="heading 2" w:uiPriority="9" w:qFormat="1"/>
@@ -1172,52 +1399,7 @@
     <w:rPr>
       <w:rFonts w:ascii="Calibri" w:hAnsi="Calibri"/>
       <w:color w:val="333333"/>
-      <w:sz w:val="22"/>
     </w:rPr>
-  </w:style>
-  <w:style w:type="paragraph" w:styleId="Header">
-    <w:name w:val="header"/>
-    <w:basedOn w:val="Normal"/>
-    <w:link w:val="HeaderChar"/>
-    <w:uiPriority w:val="99"/>
-    <w:unhideWhenUsed/>
-    <w:rsid w:val="00E618BF"/>
-    <w:pPr>
-      <w:tabs>
-        <w:tab w:val="center" w:pos="4680"/>
-        <w:tab w:val="right" w:pos="9360"/>
-      </w:tabs>
-      <w:spacing w:after="0" w:line="240" w:lineRule="auto"/>
-    </w:pPr>
-  </w:style>
-  <w:style w:type="character" w:customStyle="1" w:styleId="HeaderChar">
-    <w:name w:val="Header Char"/>
-    <w:basedOn w:val="DefaultParagraphFont"/>
-    <w:link w:val="Header"/>
-    <w:uiPriority w:val="99"/>
-    <w:rsid w:val="00E618BF"/>
-  </w:style>
-  <w:style w:type="paragraph" w:styleId="Footer">
-    <w:name w:val="footer"/>
-    <w:basedOn w:val="Normal"/>
-    <w:link w:val="FooterChar"/>
-    <w:uiPriority w:val="99"/>
-    <w:unhideWhenUsed/>
-    <w:rsid w:val="00E618BF"/>
-    <w:pPr>
-      <w:tabs>
-        <w:tab w:val="center" w:pos="4680"/>
-        <w:tab w:val="right" w:pos="9360"/>
-      </w:tabs>
-      <w:spacing w:after="0" w:line="240" w:lineRule="auto"/>
-    </w:pPr>
-  </w:style>
-  <w:style w:type="character" w:customStyle="1" w:styleId="FooterChar">
-    <w:name w:val="Footer Char"/>
-    <w:basedOn w:val="DefaultParagraphFont"/>
-    <w:link w:val="Footer"/>
-    <w:uiPriority w:val="99"/>
-    <w:rsid w:val="00E618BF"/>
   </w:style>
   <w:style w:type="paragraph" w:styleId="Heading1">
     <w:name w:val="heading 1"/>
@@ -1454,6 +1636,50 @@
     <w:uiPriority w:val="99"/>
     <w:semiHidden/>
     <w:unhideWhenUsed/>
+  </w:style>
+  <w:style w:type="paragraph" w:styleId="Header">
+    <w:name w:val="header"/>
+    <w:basedOn w:val="Normal"/>
+    <w:link w:val="HeaderChar"/>
+    <w:uiPriority w:val="99"/>
+    <w:unhideWhenUsed/>
+    <w:rsid w:val="00E618BF"/>
+    <w:pPr>
+      <w:tabs>
+        <w:tab w:val="center" w:pos="4680"/>
+        <w:tab w:val="right" w:pos="9360"/>
+      </w:tabs>
+      <w:spacing w:after="0" w:line="240" w:lineRule="auto"/>
+    </w:pPr>
+  </w:style>
+  <w:style w:type="character" w:customStyle="1" w:styleId="HeaderChar">
+    <w:name w:val="Header Char"/>
+    <w:basedOn w:val="DefaultParagraphFont"/>
+    <w:link w:val="Header"/>
+    <w:uiPriority w:val="99"/>
+    <w:rsid w:val="00E618BF"/>
+  </w:style>
+  <w:style w:type="paragraph" w:styleId="Footer">
+    <w:name w:val="footer"/>
+    <w:basedOn w:val="Normal"/>
+    <w:link w:val="FooterChar"/>
+    <w:uiPriority w:val="99"/>
+    <w:unhideWhenUsed/>
+    <w:rsid w:val="00E618BF"/>
+    <w:pPr>
+      <w:tabs>
+        <w:tab w:val="center" w:pos="4680"/>
+        <w:tab w:val="right" w:pos="9360"/>
+      </w:tabs>
+      <w:spacing w:after="0" w:line="240" w:lineRule="auto"/>
+    </w:pPr>
+  </w:style>
+  <w:style w:type="character" w:customStyle="1" w:styleId="FooterChar">
+    <w:name w:val="Footer Char"/>
+    <w:basedOn w:val="DefaultParagraphFont"/>
+    <w:link w:val="Footer"/>
+    <w:uiPriority w:val="99"/>
+    <w:rsid w:val="00E618BF"/>
   </w:style>
   <w:style w:type="paragraph" w:styleId="NoSpacing">
     <w:name w:val="No Spacing"/>
@@ -12861,7 +13087,7 @@
 </file>
 
 <file path=word/stylesWithEffects.xml><?xml version="1.0" encoding="utf-8"?>
-<w:styles xmlns:wpc="http://schemas.microsoft.com/office/word/2010/wordprocessingCanvas" xmlns:mo="http://schemas.microsoft.com/office/mac/office/2008/main" xmlns:mc="http://schemas.openxmlformats.org/markup-compatibility/2006" xmlns:mv="urn:schemas-microsoft-com:mac:vml" xmlns:o="urn:schemas-microsoft-com:office:office" xmlns:r="http://schemas.openxmlformats.org/officeDocument/2006/relationships" xmlns:m="http://schemas.openxmlformats.org/officeDocument/2006/math" xmlns:v="urn:schemas-microsoft-com:vml" xmlns:wp14="http://schemas.microsoft.com/office/word/2010/wordprocessingDrawing" xmlns:wp="http://schemas.openxmlformats.org/drawingml/2006/wordprocessingDrawing" xmlns:w10="urn:schemas-microsoft-com:office:word" xmlns:w="http://schemas.openxmlformats.org/wordprocessingml/2006/main" xmlns:w14="http://schemas.microsoft.com/office/word/2010/wordml" xmlns:wpg="http://schemas.microsoft.com/office/word/2010/wordprocessingGroup" xmlns:wpi="http://schemas.microsoft.com/office/word/2010/wordprocessingInk" xmlns:wne="http://schemas.microsoft.com/office/word/2006/wordml" xmlns:wps="http://schemas.microsoft.com/office/word/2010/wordprocessingShape" mc:Ignorable="w14 wp14">
+<w:styles xmlns:wpc="http://schemas.microsoft.com/office/word/2010/wordprocessingCanvas" xmlns:mc="http://schemas.openxmlformats.org/markup-compatibility/2006" xmlns:o="urn:schemas-microsoft-com:office:office" xmlns:r="http://schemas.openxmlformats.org/officeDocument/2006/relationships" xmlns:m="http://schemas.openxmlformats.org/officeDocument/2006/math" xmlns:v="urn:schemas-microsoft-com:vml" xmlns:wp14="http://schemas.microsoft.com/office/word/2010/wordprocessingDrawing" xmlns:wp="http://schemas.openxmlformats.org/drawingml/2006/wordprocessingDrawing" xmlns:w10="urn:schemas-microsoft-com:office:word" xmlns:w="http://schemas.openxmlformats.org/wordprocessingml/2006/main" xmlns:w14="http://schemas.microsoft.com/office/word/2010/wordml" xmlns:wpg="http://schemas.microsoft.com/office/word/2010/wordprocessingGroup" xmlns:wpi="http://schemas.microsoft.com/office/word/2010/wordprocessingInk" xmlns:wne="http://schemas.microsoft.com/office/word/2006/wordml" xmlns:wps="http://schemas.microsoft.com/office/word/2010/wordprocessingShape" mc:Ignorable="w14 wp14">
   <w:docDefaults>
     <w:rPrDefault>
       <w:rPr>
@@ -12877,7 +13103,7 @@
       </w:pPr>
     </w:pPrDefault>
   </w:docDefaults>
-  <w:latentStyles w:defLockedState="0" w:defUIPriority="99" w:defSemiHidden="1" w:defUnhideWhenUsed="1" w:defQFormat="0" w:count="276">
+  <w:latentStyles w:defLockedState="0" w:defUIPriority="99" w:defSemiHidden="1" w:defUnhideWhenUsed="1" w:defQFormat="0" w:count="267">
     <w:lsdException w:name="Normal" w:semiHidden="0" w:uiPriority="0" w:unhideWhenUsed="0" w:qFormat="1"/>
     <w:lsdException w:name="heading 1" w:semiHidden="0" w:uiPriority="9" w:unhideWhenUsed="0" w:qFormat="1"/>
     <w:lsdException w:name="heading 2" w:uiPriority="9" w:qFormat="1"/>
@@ -13020,6 +13246,10 @@
     <w:name w:val="Normal"/>
     <w:qFormat/>
     <w:rsid w:val="00FC693F"/>
+    <w:rPr>
+      <w:rFonts w:ascii="Calibri" w:hAnsi="Calibri"/>
+      <w:color w:val="333333"/>
+    </w:rPr>
   </w:style>
   <w:style w:type="paragraph" w:styleId="Heading1">
     <w:name w:val="heading 1"/>
@@ -13039,7 +13269,7 @@
       <w:rFonts w:asciiTheme="majorHAnsi" w:eastAsiaTheme="majorEastAsia" w:hAnsiTheme="majorHAnsi" w:cstheme="majorBidi"/>
       <w:b/>
       <w:bCs/>
-      <w:color w:val="365F91" w:themeColor="accent1" w:themeShade="BF"/>
+      <w:color w:val="0F172A"/>
       <w:sz w:val="28"/>
       <w:szCs w:val="28"/>
     </w:rPr>
@@ -13256,6 +13486,50 @@
     <w:uiPriority w:val="99"/>
     <w:semiHidden/>
     <w:unhideWhenUsed/>
+  </w:style>
+  <w:style w:type="paragraph" w:styleId="Header">
+    <w:name w:val="header"/>
+    <w:basedOn w:val="Normal"/>
+    <w:link w:val="HeaderChar"/>
+    <w:uiPriority w:val="99"/>
+    <w:unhideWhenUsed/>
+    <w:rsid w:val="00E618BF"/>
+    <w:pPr>
+      <w:tabs>
+        <w:tab w:val="center" w:pos="4680"/>
+        <w:tab w:val="right" w:pos="9360"/>
+      </w:tabs>
+      <w:spacing w:after="0" w:line="240" w:lineRule="auto"/>
+    </w:pPr>
+  </w:style>
+  <w:style w:type="character" w:customStyle="1" w:styleId="HeaderChar">
+    <w:name w:val="Header Char"/>
+    <w:basedOn w:val="DefaultParagraphFont"/>
+    <w:link w:val="Header"/>
+    <w:uiPriority w:val="99"/>
+    <w:rsid w:val="00E618BF"/>
+  </w:style>
+  <w:style w:type="paragraph" w:styleId="Footer">
+    <w:name w:val="footer"/>
+    <w:basedOn w:val="Normal"/>
+    <w:link w:val="FooterChar"/>
+    <w:uiPriority w:val="99"/>
+    <w:unhideWhenUsed/>
+    <w:rsid w:val="00E618BF"/>
+    <w:pPr>
+      <w:tabs>
+        <w:tab w:val="center" w:pos="4680"/>
+        <w:tab w:val="right" w:pos="9360"/>
+      </w:tabs>
+      <w:spacing w:after="0" w:line="240" w:lineRule="auto"/>
+    </w:pPr>
+  </w:style>
+  <w:style w:type="character" w:customStyle="1" w:styleId="FooterChar">
+    <w:name w:val="Footer Char"/>
+    <w:basedOn w:val="DefaultParagraphFont"/>
+    <w:link w:val="Footer"/>
+    <w:uiPriority w:val="99"/>
+    <w:rsid w:val="00E618BF"/>
   </w:style>
   <w:style w:type="paragraph" w:styleId="NoSpacing">
     <w:name w:val="No Spacing"/>
@@ -24987,7 +25261,7 @@
 </file>
 
 <file path=customXml/itemProps1.xml><?xml version="1.0" encoding="utf-8"?>
-<ds:datastoreItem xmlns:ds="http://schemas.openxmlformats.org/officeDocument/2006/customXml" ds:itemID="{EF278816-EC6F-A645-907D-7F25AECB1D4A}">
+<ds:datastoreItem xmlns:ds="http://schemas.openxmlformats.org/officeDocument/2006/customXml" ds:itemID="{AF29FF26-5A5A-4248-9F88-F42EACAD28D5}">
   <ds:schemaRefs>
     <ds:schemaRef ds:uri="http://schemas.openxmlformats.org/officeDocument/2006/bibliography"/>
   </ds:schemaRefs>

</xml_diff>